<commit_message>
docs: verify mobile fixes in production, log Entry B, record D-06/D-07
</commit_message>
<xml_diff>
--- a/STATE_OF_THE_BUILD.docx
+++ b/STATE_OF_THE_BUILD.docx
@@ -2,7 +2,7 @@
 <file path=word/document.xml><?xml version="1.0" encoding="utf-8"?>
 <w:document xmlns:w="http://schemas.openxmlformats.org/wordprocessingml/2006/main" xmlns:m="http://schemas.openxmlformats.org/officeDocument/2006/math" xmlns:r="http://schemas.openxmlformats.org/officeDocument/2006/relationships" xmlns:o="urn:schemas-microsoft-com:office:office" xmlns:v="urn:schemas-microsoft-com:vml" xmlns:w10="urn:schemas-microsoft-com:office:word" xmlns:a="http://schemas.openxmlformats.org/drawingml/2006/main" xmlns:pic="http://schemas.openxmlformats.org/drawingml/2006/picture" xmlns:wp="http://schemas.openxmlformats.org/drawingml/2006/wordprocessingDrawing">
   <w:body>
-    <w:bookmarkStart w:id="44" w:name="state-of-the-build-bright-box-homes"/>
+    <w:bookmarkStart w:id="45" w:name="state-of-the-build-bright-box-homes"/>
     <w:p>
       <w:pPr>
         <w:pStyle w:val="Heading1"/>
@@ -3367,6 +3367,181 @@
           </w:p>
         </w:tc>
       </w:tr>
+      <w:tr>
+        <w:tc>
+          <w:tcPr/>
+          <w:p>
+            <w:pPr>
+              <w:pStyle w:val="Compact"/>
+              <w:jc w:val="left"/>
+            </w:pPr>
+            <w:r>
+              <w:t xml:space="preserve">D-06</w:t>
+            </w:r>
+          </w:p>
+        </w:tc>
+        <w:tc>
+          <w:tcPr/>
+          <w:p>
+            <w:pPr>
+              <w:pStyle w:val="Compact"/>
+              <w:jc w:val="left"/>
+            </w:pPr>
+            <w:r>
+              <w:rPr>
+                <w:rStyle w:val="VerbatimChar"/>
+              </w:rPr>
+              <w:t xml:space="preserve">/design</w:t>
+            </w:r>
+          </w:p>
+        </w:tc>
+        <w:tc>
+          <w:tcPr/>
+          <w:p>
+            <w:pPr>
+              <w:pStyle w:val="Compact"/>
+              <w:jc w:val="left"/>
+            </w:pPr>
+            <w:r>
+              <w:rPr>
+                <w:rStyle w:val="VerbatimChar"/>
+              </w:rPr>
+              <w:t xml:space="preserve">HomeConfigurator</w:t>
+            </w:r>
+            <w:r>
+              <w:t xml:space="preserve"> </w:t>
+            </w:r>
+            <w:r>
+              <w:t xml:space="preserve">labels the running figure</w:t>
+            </w:r>
+            <w:r>
+              <w:t xml:space="preserve"> </w:t>
+            </w:r>
+            <w:r>
+              <w:t xml:space="preserve">“</w:t>
+            </w:r>
+            <w:r>
+              <w:t xml:space="preserve">Upgrades Total</w:t>
+            </w:r>
+            <w:r>
+              <w:t xml:space="preserve">”</w:t>
+            </w:r>
+            <w:r>
+              <w:t xml:space="preserve">, but the figure includes the base home price. With only a 20×20 selected it reads</w:t>
+            </w:r>
+            <w:r>
+              <w:t xml:space="preserve"> </w:t>
+            </w:r>
+            <w:r>
+              <w:t xml:space="preserve">“</w:t>
+            </w:r>
+            <w:r>
+              <w:t xml:space="preserve">Upgrades Total $45,995</w:t>
+            </w:r>
+            <w:r>
+              <w:t xml:space="preserve">”</w:t>
+            </w:r>
+            <w:r>
+              <w:t xml:space="preserve"> </w:t>
+            </w:r>
+            <w:r>
+              <w:t xml:space="preserve">when zero upgrades have been chosen. Open — customer-facing pricing copy</w:t>
+            </w:r>
+          </w:p>
+        </w:tc>
+        <w:tc>
+          <w:tcPr/>
+          <w:p>
+            <w:pPr>
+              <w:pStyle w:val="Compact"/>
+              <w:jc w:val="left"/>
+            </w:pPr>
+            <w:r>
+              <w:t xml:space="preserve">Production screenshot, 2026-09-24</w:t>
+            </w:r>
+          </w:p>
+        </w:tc>
+      </w:tr>
+      <w:tr>
+        <w:tc>
+          <w:tcPr/>
+          <w:p>
+            <w:pPr>
+              <w:pStyle w:val="Compact"/>
+              <w:jc w:val="left"/>
+            </w:pPr>
+            <w:r>
+              <w:t xml:space="preserve">D-07</w:t>
+            </w:r>
+          </w:p>
+        </w:tc>
+        <w:tc>
+          <w:tcPr/>
+          <w:p>
+            <w:pPr>
+              <w:pStyle w:val="Compact"/>
+              <w:jc w:val="left"/>
+            </w:pPr>
+            <w:r>
+              <w:rPr>
+                <w:rStyle w:val="VerbatimChar"/>
+              </w:rPr>
+              <w:t xml:space="preserve">/design</w:t>
+            </w:r>
+          </w:p>
+        </w:tc>
+        <w:tc>
+          <w:tcPr/>
+          <w:p>
+            <w:pPr>
+              <w:pStyle w:val="Compact"/>
+              <w:jc w:val="left"/>
+            </w:pPr>
+            <w:r>
+              <w:rPr>
+                <w:rStyle w:val="VerbatimChar"/>
+              </w:rPr>
+              <w:t xml:space="preserve">OrderPanel</w:t>
+            </w:r>
+            <w:r>
+              <w:t xml:space="preserve"> </w:t>
+            </w:r>
+            <w:r>
+              <w:t xml:space="preserve">prints</w:t>
+            </w:r>
+            <w:r>
+              <w:t xml:space="preserve"> </w:t>
+            </w:r>
+            <w:r>
+              <w:t xml:space="preserve">“</w:t>
+            </w:r>
+            <w:r>
+              <w:t xml:space="preserve">Base home price not included above</w:t>
+            </w:r>
+            <w:r>
+              <w:t xml:space="preserve">”</w:t>
+            </w:r>
+            <w:r>
+              <w:t xml:space="preserve"> </w:t>
+            </w:r>
+            <w:r>
+              <w:t xml:space="preserve">while the base home is itself a line item in the panel. The two statements contradict. Open — customer-facing pricing copy</w:t>
+            </w:r>
+          </w:p>
+        </w:tc>
+        <w:tc>
+          <w:tcPr/>
+          <w:p>
+            <w:pPr>
+              <w:pStyle w:val="Compact"/>
+              <w:jc w:val="left"/>
+            </w:pPr>
+            <w:r>
+              <w:t xml:space="preserve">Production screenshot, 2026-09-24</w:t>
+            </w:r>
+          </w:p>
+        </w:tc>
+      </w:tr>
     </w:tbl>
     <w:bookmarkStart w:id="36" w:name="corrected-earlier-claim"/>
     <w:p>
@@ -3872,13 +4047,88 @@
           <w:bCs/>
           <w:b/>
         </w:rPr>
-        <w:t xml:space="preserve">Verification status: PARTIAL.</w:t>
-      </w:r>
-      <w:r>
-        <w:t xml:space="preserve"> </w:t>
-      </w:r>
-      <w:r>
-        <w:t xml:space="preserve">Type-check passed. Production build, deployment and browser confirmation of the fix had not been executed at the time of writing. These changes are NOT verified complete under Law 10 until a preview deployment has been inspected in a real browser at 390px and</w:t>
+        <w:t xml:space="preserve">Verification status: VERIFIED COMPLETE on 2026-09-24.</w:t>
+      </w:r>
+      <w:r>
+        <w:t xml:space="preserve"> </w:t>
+      </w:r>
+      <w:r>
+        <w:t xml:space="preserve">Merged to</w:t>
+      </w:r>
+      <w:r>
+        <w:t xml:space="preserve"> </w:t>
+      </w:r>
+      <w:r>
+        <w:rPr>
+          <w:rStyle w:val="VerbatimChar"/>
+        </w:rPr>
+        <w:t xml:space="preserve">main</w:t>
+      </w:r>
+      <w:r>
+        <w:t xml:space="preserve"> </w:t>
+      </w:r>
+      <w:r>
+        <w:t xml:space="preserve">at commit</w:t>
+      </w:r>
+      <w:r>
+        <w:t xml:space="preserve"> </w:t>
+      </w:r>
+      <w:r>
+        <w:rPr>
+          <w:rStyle w:val="VerbatimChar"/>
+        </w:rPr>
+        <w:t xml:space="preserve">20e6877</w:t>
+      </w:r>
+      <w:r>
+        <w:t xml:space="preserve"> </w:t>
+      </w:r>
+      <w:r>
+        <w:t xml:space="preserve">(fast-forward from</w:t>
+      </w:r>
+      <w:r>
+        <w:t xml:space="preserve"> </w:t>
+      </w:r>
+      <w:r>
+        <w:rPr>
+          <w:rStyle w:val="VerbatimChar"/>
+        </w:rPr>
+        <w:t xml:space="preserve">e8759df</w:t>
+      </w:r>
+      <w:r>
+        <w:t xml:space="preserve">) and deployed to production. Measured in Chromium against</w:t>
+      </w:r>
+      <w:r>
+        <w:t xml:space="preserve"> </w:t>
+      </w:r>
+      <w:r>
+        <w:rPr>
+          <w:rStyle w:val="VerbatimChar"/>
+        </w:rPr>
+        <w:t xml:space="preserve">https://brightboxhomes.com</w:t>
+      </w:r>
+      <w:r>
+        <w:t xml:space="preserve">:</w:t>
+      </w:r>
+    </w:p>
+    <w:p>
+      <w:pPr>
+        <w:numPr>
+          <w:ilvl w:val="0"/>
+          <w:numId w:val="1006"/>
+        </w:numPr>
+        <w:pStyle w:val="Compact"/>
+      </w:pPr>
+      <w:r>
+        <w:rPr>
+          <w:rStyle w:val="VerbatimChar"/>
+        </w:rPr>
+        <w:t xml:space="preserve">/design</w:t>
+      </w:r>
+      <w:r>
+        <w:t xml:space="preserve"> </w:t>
+      </w:r>
+      <w:r>
+        <w:t xml:space="preserve">at 390 × 844 —</w:t>
       </w:r>
       <w:r>
         <w:t xml:space="preserve"> </w:t>
@@ -3893,7 +4143,7 @@
         <w:t xml:space="preserve"> </w:t>
       </w:r>
       <w:r>
-        <w:t xml:space="preserve">equals</w:t>
+        <w:t xml:space="preserve">390,</w:t>
       </w:r>
       <w:r>
         <w:t xml:space="preserve"> </w:t>
@@ -3905,7 +4155,145 @@
         <w:t xml:space="preserve">clientWidth</w:t>
       </w:r>
       <w:r>
-        <w:t xml:space="preserve">.</w:t>
+        <w:t xml:space="preserve"> </w:t>
+      </w:r>
+      <w:r>
+        <w:t xml:space="preserve">390. Horizontal overflow eliminated (D-01 closed).</w:t>
+      </w:r>
+    </w:p>
+    <w:p>
+      <w:pPr>
+        <w:numPr>
+          <w:ilvl w:val="0"/>
+          <w:numId w:val="1006"/>
+        </w:numPr>
+        <w:pStyle w:val="Compact"/>
+      </w:pPr>
+      <w:r>
+        <w:rPr>
+          <w:rStyle w:val="VerbatimChar"/>
+        </w:rPr>
+        <w:t xml:space="preserve">/design</w:t>
+      </w:r>
+      <w:r>
+        <w:t xml:space="preserve"> </w:t>
+      </w:r>
+      <w:r>
+        <w:t xml:space="preserve">at 1440 × 900 —</w:t>
+      </w:r>
+      <w:r>
+        <w:t xml:space="preserve"> </w:t>
+      </w:r>
+      <w:r>
+        <w:rPr>
+          <w:rStyle w:val="VerbatimChar"/>
+        </w:rPr>
+        <w:t xml:space="preserve">scrollWidth</w:t>
+      </w:r>
+      <w:r>
+        <w:t xml:space="preserve"> </w:t>
+      </w:r>
+      <w:r>
+        <w:t xml:space="preserve">1440,</w:t>
+      </w:r>
+      <w:r>
+        <w:t xml:space="preserve"> </w:t>
+      </w:r>
+      <w:r>
+        <w:rPr>
+          <w:rStyle w:val="VerbatimChar"/>
+        </w:rPr>
+        <w:t xml:space="preserve">clientWidth</w:t>
+      </w:r>
+      <w:r>
+        <w:t xml:space="preserve"> </w:t>
+      </w:r>
+      <w:r>
+        <w:t xml:space="preserve">1440. No desktop regression.</w:t>
+      </w:r>
+    </w:p>
+    <w:p>
+      <w:pPr>
+        <w:numPr>
+          <w:ilvl w:val="0"/>
+          <w:numId w:val="1006"/>
+        </w:numPr>
+        <w:pStyle w:val="Compact"/>
+      </w:pPr>
+      <w:r>
+        <w:rPr>
+          <w:rStyle w:val="VerbatimChar"/>
+        </w:rPr>
+        <w:t xml:space="preserve">/design</w:t>
+      </w:r>
+      <w:r>
+        <w:t xml:space="preserve"> </w:t>
+      </w:r>
+      <w:r>
+        <w:t xml:space="preserve">hero renders full-bleed with legible copy over a vertical scrim on phones (D-02 closed).</w:t>
+      </w:r>
+    </w:p>
+    <w:p>
+      <w:pPr>
+        <w:numPr>
+          <w:ilvl w:val="0"/>
+          <w:numId w:val="1006"/>
+        </w:numPr>
+        <w:pStyle w:val="Compact"/>
+      </w:pPr>
+      <w:r>
+        <w:t xml:space="preserve">Step bar renders on the amber system, all six steps reachable within a 390px viewport (D-03 closed).</w:t>
+      </w:r>
+    </w:p>
+    <w:p>
+      <w:pPr>
+        <w:numPr>
+          <w:ilvl w:val="0"/>
+          <w:numId w:val="1006"/>
+        </w:numPr>
+        <w:pStyle w:val="Compact"/>
+      </w:pPr>
+      <w:r>
+        <w:t xml:space="preserve">Selecting the 20×20 model raises the floating</w:t>
+      </w:r>
+      <w:r>
+        <w:t xml:space="preserve"> </w:t>
+      </w:r>
+      <w:r>
+        <w:t xml:space="preserve">“</w:t>
+      </w:r>
+      <w:r>
+        <w:t xml:space="preserve">View Your Build</w:t>
+      </w:r>
+      <w:r>
+        <w:t xml:space="preserve">”</w:t>
+      </w:r>
+      <w:r>
+        <w:t xml:space="preserve"> </w:t>
+      </w:r>
+      <w:r>
+        <w:t xml:space="preserve">button; tapping it opens the bottom sheet containing the configurator and invoice; page overflow remains 390/390 while the sheet is open (D-04 closed).</w:t>
+      </w:r>
+    </w:p>
+    <w:p>
+      <w:pPr>
+        <w:numPr>
+          <w:ilvl w:val="0"/>
+          <w:numId w:val="1006"/>
+        </w:numPr>
+        <w:pStyle w:val="Compact"/>
+      </w:pPr>
+      <w:r>
+        <w:rPr>
+          <w:rStyle w:val="VerbatimChar"/>
+        </w:rPr>
+        <w:t xml:space="preserve">/5k-challenge</w:t>
+      </w:r>
+      <w:r>
+        <w:t xml:space="preserve"> </w:t>
+      </w:r>
+      <w:r>
+        <w:t xml:space="preserve">at 390px — headline computes to 28px, 64px tall, 342px wide: exactly two lines, no orphaned dollar figure (D-05 closed).</w:t>
       </w:r>
     </w:p>
     <w:p>
@@ -4344,19 +4732,19 @@
               <w:jc w:val="left"/>
             </w:pPr>
             <w:r>
-              <w:t xml:space="preserve">Duplex price differs between code ($59,995) and Entry 1 ($64,995)</w:t>
-            </w:r>
-          </w:p>
-        </w:tc>
-        <w:tc>
-          <w:tcPr/>
-          <w:p>
-            <w:pPr>
-              <w:pStyle w:val="Compact"/>
-              <w:jc w:val="left"/>
-            </w:pPr>
-            <w:r>
-              <w:t xml:space="preserve">Unresolved pricing contradiction</w:t>
+              <w:t xml:space="preserve">CLOSED 2026-09-24 — Owner confirmed the Duplex price is $59,995. Code is canonical; Entry 1’s $64,995 is superseded</w:t>
+            </w:r>
+          </w:p>
+        </w:tc>
+        <w:tc>
+          <w:tcPr/>
+          <w:p>
+            <w:pPr>
+              <w:pStyle w:val="Compact"/>
+              <w:jc w:val="left"/>
+            </w:pPr>
+            <w:r>
+              <w:t xml:space="preserve">—</w:t>
             </w:r>
           </w:p>
         </w:tc>
@@ -4498,24 +4886,12 @@
       <w:pPr>
         <w:numPr>
           <w:ilvl w:val="0"/>
-          <w:numId w:val="1006"/>
+          <w:numId w:val="1007"/>
         </w:numPr>
         <w:pStyle w:val="Compact"/>
       </w:pPr>
       <w:r>
-        <w:t xml:space="preserve">Deploy the 2026-09-23 fixes to a Vercel preview from branch</w:t>
-      </w:r>
-      <w:r>
-        <w:t xml:space="preserve"> </w:t>
-      </w:r>
-      <w:r>
-        <w:rPr>
-          <w:rStyle w:val="VerbatimChar"/>
-        </w:rPr>
-        <w:t xml:space="preserve">fix/design-mobile-2026-09-23</w:t>
-      </w:r>
-      <w:r>
-        <w:t xml:space="preserve">, confirm in a real browser at 390px that horizontal overflow is gone and the build sheet opens, then merge to</w:t>
+        <w:t xml:space="preserve">DONE 2026-09-24 — fixes merged to</w:t>
       </w:r>
       <w:r>
         <w:t xml:space="preserve"> </w:t>
@@ -4527,14 +4903,14 @@
         <w:t xml:space="preserve">main</w:t>
       </w:r>
       <w:r>
-        <w:t xml:space="preserve">. Closes the verification gap in §6.</w:t>
+        <w:t xml:space="preserve">, deployed, and verified in a real browser. See §6.</w:t>
       </w:r>
     </w:p>
     <w:p>
       <w:pPr>
         <w:numPr>
           <w:ilvl w:val="0"/>
-          <w:numId w:val="1006"/>
+          <w:numId w:val="1007"/>
         </w:numPr>
         <w:pStyle w:val="Compact"/>
       </w:pPr>
@@ -4546,49 +4922,19 @@
       <w:pPr>
         <w:numPr>
           <w:ilvl w:val="0"/>
-          <w:numId w:val="1006"/>
+          <w:numId w:val="1007"/>
         </w:numPr>
         <w:pStyle w:val="Compact"/>
       </w:pPr>
       <w:r>
-        <w:t xml:space="preserve">Close B-04: add a</w:t>
-      </w:r>
-      <w:r>
-        <w:t xml:space="preserve"> </w:t>
-      </w:r>
-      <w:r>
-        <w:rPr>
-          <w:rStyle w:val="VerbatimChar"/>
-        </w:rPr>
-        <w:t xml:space="preserve">typecheck</w:t>
-      </w:r>
-      <w:r>
-        <w:t xml:space="preserve"> </w:t>
-      </w:r>
-      <w:r>
-        <w:t xml:space="preserve">script, install Playwright, write a smoke suite covering the live routes, and create</w:t>
-      </w:r>
-      <w:r>
-        <w:t xml:space="preserve"> </w:t>
-      </w:r>
-      <w:r>
-        <w:rPr>
-          <w:rStyle w:val="VerbatimChar"/>
-        </w:rPr>
-        <w:t xml:space="preserve">deploy.ps1</w:t>
-      </w:r>
-      <w:r>
-        <w:t xml:space="preserve"> </w:t>
-      </w:r>
-      <w:r>
-        <w:t xml:space="preserve">implementing the Owner’s canonical sequence.</w:t>
+        <w:t xml:space="preserve">Fix D-06 and D-07 — the two pricing-copy contradictions in the configurator panel. Small, customer-facing, and cheap to fold into the configurator work.</w:t>
       </w:r>
     </w:p>
     <w:p>
       <w:pPr>
         <w:numPr>
           <w:ilvl w:val="0"/>
-          <w:numId w:val="1006"/>
+          <w:numId w:val="1007"/>
         </w:numPr>
         <w:pStyle w:val="Compact"/>
       </w:pPr>
@@ -4600,7 +4946,7 @@
       <w:pPr>
         <w:numPr>
           <w:ilvl w:val="0"/>
-          <w:numId w:val="1006"/>
+          <w:numId w:val="1007"/>
         </w:numPr>
         <w:pStyle w:val="Compact"/>
       </w:pPr>
@@ -4616,7 +4962,7 @@
       </w:r>
     </w:p>
     <w:bookmarkEnd w:id="41"/>
-    <w:bookmarkStart w:id="43" w:name="entry-log"/>
+    <w:bookmarkStart w:id="44" w:name="entry-log"/>
     <w:p>
       <w:pPr>
         <w:pStyle w:val="Heading2"/>
@@ -4797,8 +5143,287 @@
       </w:r>
     </w:p>
     <w:bookmarkEnd w:id="42"/>
+    <w:bookmarkStart w:id="43" w:name="Xb61f50a77b8fd372190692c7dc63054b15aba94"/>
+    <w:p>
+      <w:pPr>
+        <w:pStyle w:val="Heading3"/>
+      </w:pPr>
+      <w:r>
+        <w:t xml:space="preserve">Entry B — Mobile fixes merged, deployed and verified in production</w:t>
+      </w:r>
+    </w:p>
+    <w:p>
+      <w:pPr>
+        <w:pStyle w:val="FirstParagraph"/>
+      </w:pPr>
+      <w:r>
+        <w:rPr>
+          <w:bCs/>
+          <w:b/>
+        </w:rPr>
+        <w:t xml:space="preserve">Date:</w:t>
+      </w:r>
+      <w:r>
+        <w:t xml:space="preserve"> </w:t>
+      </w:r>
+      <w:r>
+        <w:t xml:space="preserve">2026-09-24</w:t>
+      </w:r>
+      <w:r>
+        <w:t xml:space="preserve"> </w:t>
+      </w:r>
+      <w:r>
+        <w:rPr>
+          <w:bCs/>
+          <w:b/>
+        </w:rPr>
+        <w:t xml:space="preserve">Commit:</w:t>
+      </w:r>
+      <w:r>
+        <w:t xml:space="preserve"> </w:t>
+      </w:r>
+      <w:r>
+        <w:rPr>
+          <w:rStyle w:val="VerbatimChar"/>
+        </w:rPr>
+        <w:t xml:space="preserve">20e6877</w:t>
+      </w:r>
+      <w:r>
+        <w:t xml:space="preserve"> </w:t>
+      </w:r>
+      <w:r>
+        <w:t xml:space="preserve">on</w:t>
+      </w:r>
+      <w:r>
+        <w:t xml:space="preserve"> </w:t>
+      </w:r>
+      <w:r>
+        <w:rPr>
+          <w:rStyle w:val="VerbatimChar"/>
+        </w:rPr>
+        <w:t xml:space="preserve">main</w:t>
+      </w:r>
+      <w:r>
+        <w:t xml:space="preserve"> </w:t>
+      </w:r>
+      <w:r>
+        <w:t xml:space="preserve">(fast-forward from</w:t>
+      </w:r>
+      <w:r>
+        <w:t xml:space="preserve"> </w:t>
+      </w:r>
+      <w:r>
+        <w:rPr>
+          <w:rStyle w:val="VerbatimChar"/>
+        </w:rPr>
+        <w:t xml:space="preserve">e8759df</w:t>
+      </w:r>
+      <w:r>
+        <w:t xml:space="preserve">); branch</w:t>
+      </w:r>
+      <w:r>
+        <w:t xml:space="preserve"> </w:t>
+      </w:r>
+      <w:r>
+        <w:rPr>
+          <w:rStyle w:val="VerbatimChar"/>
+        </w:rPr>
+        <w:t xml:space="preserve">fix/design-mobile-2026-09-23</w:t>
+      </w:r>
+      <w:r>
+        <w:t xml:space="preserve"> </w:t>
+      </w:r>
+      <w:r>
+        <w:rPr>
+          <w:bCs/>
+          <w:b/>
+        </w:rPr>
+        <w:t xml:space="preserve">Phase:</w:t>
+      </w:r>
+      <w:r>
+        <w:t xml:space="preserve"> </w:t>
+      </w:r>
+      <w:r>
+        <w:t xml:space="preserve">Marketing site hardening</w:t>
+      </w:r>
+      <w:r>
+        <w:t xml:space="preserve"> </w:t>
+      </w:r>
+      <w:r>
+        <w:rPr>
+          <w:bCs/>
+          <w:b/>
+        </w:rPr>
+        <w:t xml:space="preserve">Scope:</w:t>
+      </w:r>
+      <w:r>
+        <w:t xml:space="preserve"> </w:t>
+      </w:r>
+      <w:r>
+        <w:t xml:space="preserve">Merge and production verification of the five files changed in Entry A</w:t>
+      </w:r>
+      <w:r>
+        <w:t xml:space="preserve"> </w:t>
+      </w:r>
+      <w:r>
+        <w:rPr>
+          <w:bCs/>
+          <w:b/>
+        </w:rPr>
+        <w:t xml:space="preserve">Outcome:</w:t>
+      </w:r>
+      <w:r>
+        <w:t xml:space="preserve"> </w:t>
+      </w:r>
+      <w:r>
+        <w:t xml:space="preserve">D-01 through D-05 closed, each confirmed by measurement against the live site rather than by build status. §6 upgraded from PARTIAL to VERIFIED COMPLETE. B-06 closed on Owner confirmation.</w:t>
+      </w:r>
+      <w:r>
+        <w:t xml:space="preserve"> </w:t>
+      </w:r>
+      <w:r>
+        <w:rPr>
+          <w:bCs/>
+          <w:b/>
+        </w:rPr>
+        <w:t xml:space="preserve">Incidents:</w:t>
+      </w:r>
+      <w:r>
+        <w:t xml:space="preserve"> </w:t>
+      </w:r>
+      <w:r>
+        <w:rPr>
+          <w:rStyle w:val="VerbatimChar"/>
+        </w:rPr>
+        <w:t xml:space="preserve">.env.local.txt</w:t>
+      </w:r>
+      <w:r>
+        <w:t xml:space="preserve"> </w:t>
+      </w:r>
+      <w:r>
+        <w:t xml:space="preserve">was swept into commit</w:t>
+      </w:r>
+      <w:r>
+        <w:t xml:space="preserve"> </w:t>
+      </w:r>
+      <w:r>
+        <w:rPr>
+          <w:rStyle w:val="VerbatimChar"/>
+        </w:rPr>
+        <w:t xml:space="preserve">6e3a0c0</w:t>
+      </w:r>
+      <w:r>
+        <w:t xml:space="preserve"> </w:t>
+      </w:r>
+      <w:r>
+        <w:t xml:space="preserve">by a blanket</w:t>
+      </w:r>
+      <w:r>
+        <w:t xml:space="preserve"> </w:t>
+      </w:r>
+      <w:r>
+        <w:rPr>
+          <w:rStyle w:val="VerbatimChar"/>
+        </w:rPr>
+        <w:t xml:space="preserve">git add -A</w:t>
+      </w:r>
+      <w:r>
+        <w:t xml:space="preserve"> </w:t>
+      </w:r>
+      <w:r>
+        <w:t xml:space="preserve">supplied by the assistant, and pushed to the private GitHub remote. Caught on review of the commit output. Remediated the same day: file untracked, added to</w:t>
+      </w:r>
+      <w:r>
+        <w:t xml:space="preserve"> </w:t>
+      </w:r>
+      <w:r>
+        <w:rPr>
+          <w:rStyle w:val="VerbatimChar"/>
+        </w:rPr>
+        <w:t xml:space="preserve">.gitignore</w:t>
+      </w:r>
+      <w:r>
+        <w:t xml:space="preserve">, commit amended to</w:t>
+      </w:r>
+      <w:r>
+        <w:t xml:space="preserve"> </w:t>
+      </w:r>
+      <w:r>
+        <w:rPr>
+          <w:rStyle w:val="VerbatimChar"/>
+        </w:rPr>
+        <w:t xml:space="preserve">20e6877</w:t>
+      </w:r>
+      <w:r>
+        <w:t xml:space="preserve">, branch force-pushed. The orphaned object may persist server-side until GitHub garbage-collects. Key rotation left to the Owner’s judgement. Root cause: the assistant issued</w:t>
+      </w:r>
+      <w:r>
+        <w:t xml:space="preserve"> </w:t>
+      </w:r>
+      <w:r>
+        <w:rPr>
+          <w:rStyle w:val="VerbatimChar"/>
+        </w:rPr>
+        <w:t xml:space="preserve">git add -A</w:t>
+      </w:r>
+      <w:r>
+        <w:t xml:space="preserve"> </w:t>
+      </w:r>
+      <w:r>
+        <w:t xml:space="preserve">without first checking untracked files in the repository root.</w:t>
+      </w:r>
+      <w:r>
+        <w:t xml:space="preserve"> </w:t>
+      </w:r>
+      <w:r>
+        <w:rPr>
+          <w:bCs/>
+          <w:b/>
+        </w:rPr>
+        <w:t xml:space="preserve">New findings:</w:t>
+      </w:r>
+      <w:r>
+        <w:t xml:space="preserve"> </w:t>
+      </w:r>
+      <w:r>
+        <w:t xml:space="preserve">D-06 and D-07 — two pricing-copy contradictions in the configurator panel, observed on production, not previously recorded.</w:t>
+      </w:r>
+      <w:r>
+        <w:t xml:space="preserve"> </w:t>
+      </w:r>
+      <w:r>
+        <w:rPr>
+          <w:bCs/>
+          <w:b/>
+        </w:rPr>
+        <w:t xml:space="preserve">Blockers:</w:t>
+      </w:r>
+      <w:r>
+        <w:t xml:space="preserve"> </w:t>
+      </w:r>
+      <w:r>
+        <w:t xml:space="preserve">B-01 through B-05, B-07, B-08 (§8)</w:t>
+      </w:r>
+      <w:r>
+        <w:t xml:space="preserve"> </w:t>
+      </w:r>
+      <w:r>
+        <w:rPr>
+          <w:bCs/>
+          <w:b/>
+        </w:rPr>
+        <w:t xml:space="preserve">Next action:</w:t>
+      </w:r>
+      <w:r>
+        <w:t xml:space="preserve"> </w:t>
+      </w:r>
+      <w:r>
+        <w:t xml:space="preserve">Next Action 2 (§9) — configurator specification</w:t>
+      </w:r>
+    </w:p>
     <w:bookmarkEnd w:id="43"/>
     <w:bookmarkEnd w:id="44"/>
+    <w:bookmarkEnd w:id="45"/>
     <w:sectPr/>
   </w:body>
 </w:document>
@@ -5085,6 +5710,9 @@
     <w:abstractNumId w:val="991"/>
   </w:num>
   <w:num w:numId="1006">
+    <w:abstractNumId w:val="991"/>
+  </w:num>
+  <w:num w:numId="1007">
     <w:abstractNumId w:val="99411"/>
     <w:lvlOverride w:ilvl="0">
       <w:startOverride w:val="1"/>

</xml_diff>